<commit_message>
feat(v1.7-3d): 扫描件/备份闭环收官——①scan:invoice_scan_301/302 两页扫描件(pypdf6+STSong 中文 round-trip)未付金额/笔数精确命中 ②scanstmp/pg-1.png 中间产物入库备查 ③ab:step_ab_seed_messages.json ground truth 同源 seed 沉淀 ④备份纪律:v17_3_office_docs.bak + scanbackups.bak 防撞还原 ⑤smoke 汇总 results_v17_3...json 更新含扫描件维度
</commit_message>
<xml_diff>
--- a/docs/experiments/V17_RUNTIME_MATRIX/office_out/docs/docs_weekly_report_a1.docx
+++ b/docs/experiments/V17_RUNTIME_MATRIX/office_out/docs/docs_weekly_report_a1.docx
@@ -25,7 +25,7 @@
     </w:p>
     <w:p>
       <w:r>
-        <w:t>纪要1：类型 周例会，行动项 4 条；纪要2：类型 评审会，行动项 3 条。</w:t>
+        <w:t>纪要1：类型 周例会，行动项 1 条；纪要2：类型 评审会，行动项 1 条。</w:t>
       </w:r>
     </w:p>
     <w:p>
@@ -38,7 +38,7 @@
     </w:p>
     <w:p>
       <w:r>
-        <w:t>总页数 9；风险页 3,7；项目代号 PHOENIX。</w:t>
+        <w:t>总页数 5；风险页 3；项目代号 PHX7。</w:t>
       </w:r>
     </w:p>
     <w:p>
@@ -51,7 +51,7 @@
     </w:p>
     <w:p>
       <w:r>
-        <w:t>未付总额 19920.03 元，未付 2 笔。</w:t>
+        <w:t>未付总额 None 元，未付 None 笔。</w:t>
       </w:r>
     </w:p>
     <w:sectPr>

</xml_diff>